<commit_message>
Aceita nome com colchetes e melhora o modelo de importacao
- Remove colchetes/aspas em volta do nome (ex.: "[Hipro]" -> "Hipro")
- Placeholder detectado por palavra-chave ("escreva"/"substitua"), nao
  mais por colchetes, evitando pular blocos validos
- Desempate prefere o equipamento da marca selecionada (ex.: dois
  "Focuskin" em marcas diferentes)
- Modelo .docx atualizado: nome sem colchetes e instrucao mais clara

Co-Authored-By: Claude Opus 4.8 (1M context) <noreply@anthropic.com>
</commit_message>
<xml_diff>
--- a/MODELO - Condicoes Orcamento Contourline.docx
+++ b/MODELO - Condicoes Orcamento Contourline.docx
@@ -19,27 +19,40 @@
     <w:p>
       <w:pPr>
         <w:jc w:val="center"/>
-        <w:spacing w:after="240"/>
+        <w:spacing w:after="120"/>
       </w:pPr>
       <w:r>
         <w:rPr>
           <w:color w:val="666666"/>
           <w:sz w:val="18"/>
         </w:rPr>
-        <w:t xml:space="preserve">Preencha cada bloco abaixo. NÃO altere os rótulos em azul ("Condição 1:", etc.) — o sistema lê por eles.</w:t>
-      </w:r>
-    </w:p>
-    <w:p>
-      <w:pPr>
+        <w:t xml:space="preserve">Preencha cada bloco abaixo. NÃO altere os rótulos em azul ("EQUIPAMENTO:", "Condição 1:", etc.) — o sistema lê por eles.</w:t>
+      </w:r>
+    </w:p>
+    <w:p>
+      <w:pPr>
+        <w:jc w:val="center"/>
         <w:spacing w:after="240"/>
       </w:pPr>
       <w:r>
         <w:rPr>
-          <w:b/>
-          <w:color w:val="000000"/>
-          <w:sz w:val="22"/>
-        </w:rPr>
-        <w:t xml:space="preserve">EQUIPAMENTO: [escreva o nome do equipamento]</w:t>
+          <w:color w:val="666666"/>
+          <w:sz w:val="18"/>
+        </w:rPr>
+        <w:t xml:space="preserve">Para vários equipamentos: copie um bloco inteiro (de EQUIPAMENTO: até a Condição 4) e cole abaixo, trocando o nome e os valores.</w:t>
+      </w:r>
+    </w:p>
+    <w:p>
+      <w:pPr>
+        <w:spacing w:after="120"/>
+      </w:pPr>
+      <w:r>
+        <w:rPr>
+          <w:b/>
+          <w:color w:val="000000"/>
+          <w:sz w:val="24"/>
+        </w:rPr>
+        <w:t xml:space="preserve">EQUIPAMENTO: escreva aqui o nome (ex.: HIPRO MED, Focuskin, Supreme Pro)</w:t>
       </w:r>
     </w:p>
     <w:p>

</xml_diff>

<commit_message>
Lista do PDF clicavel + MARCA no documento para desambiguar
- Clique no item da lista "Orcamentos no PDF" abre o equipamento para
  editar (troca marca/equipamento e rola ate os campos), sem caçar no seletor
- Importacao passa a ler uma linha "MARCA:" opcional antes de "EQUIPAMENTO:"
  e restringe a busca aquela marca (resolve nomes iguais em marcas
  diferentes, ex.: "Focuskin" em INNOVE e CONTOURLINE MED)
- Casamento de marca tambem tolerante a erros de digitacao
- Modelo .docx atualizado com a linha MARCA: e instrucoes

Co-Authored-By: Claude Opus 4.8 (1M context) <noreply@anthropic.com>
</commit_message>
<xml_diff>
--- a/MODELO - Condicoes Orcamento Contourline.docx
+++ b/MODELO - Condicoes Orcamento Contourline.docx
@@ -26,7 +26,7 @@
           <w:color w:val="666666"/>
           <w:sz w:val="18"/>
         </w:rPr>
-        <w:t xml:space="preserve">Preencha cada bloco abaixo. NÃO altere os rótulos em azul ("EQUIPAMENTO:", "Condição 1:", etc.) — o sistema lê por eles.</w:t>
+        <w:t xml:space="preserve">Preencha cada bloco abaixo. NÃO altere os rótulos em azul ("MARCA:", "EQUIPAMENTO:", "Condição 1:", etc.) — o sistema lê por eles.</w:t>
       </w:r>
     </w:p>
     <w:p>
@@ -39,7 +39,32 @@
           <w:color w:val="666666"/>
           <w:sz w:val="18"/>
         </w:rPr>
-        <w:t xml:space="preserve">Para vários equipamentos: copie um bloco inteiro (de EQUIPAMENTO: até a Condição 4) e cole abaixo, trocando o nome e os valores.</w:t>
+        <w:t xml:space="preserve">Para vários equipamentos: copie um bloco inteiro (de MARCA: até a Condição 4) e cole abaixo, trocando marca, nome e valores.</w:t>
+      </w:r>
+    </w:p>
+    <w:p>
+      <w:pPr>
+        <w:spacing w:after="40"/>
+      </w:pPr>
+      <w:r>
+        <w:rPr>
+          <w:b/>
+          <w:color w:val="000000"/>
+          <w:sz w:val="24"/>
+        </w:rPr>
+        <w:t xml:space="preserve">MARCA: CONTOURLINE MED</w:t>
+      </w:r>
+    </w:p>
+    <w:p>
+      <w:pPr>
+        <w:spacing w:after="120"/>
+      </w:pPr>
+      <w:r>
+        <w:rPr>
+          <w:color w:val="888888"/>
+          <w:sz w:val="16"/>
+        </w:rPr>
+        <w:t xml:space="preserve">(marca do equipamento — ex.: INNOVE, CONTOURLINE MED, CYNOSURE LUTRONIC, LUMENIS, VISBODY, INDIBA)</w:t>
       </w:r>
     </w:p>
     <w:p>

</xml_diff>

<commit_message>
Corrige parser (rotulos so no inicio da linha) e clique da lista
- Regex de MARCA/EQUIPAMENTO/Condicao agora ancorados ao inicio da linha
  (^ multiline). Mencoes no meio de uma frase (ex.: a instrucao do modelo
  com "EQUIPAMENTO:", "Condicao 1:") nao viram mais bloco/condicao fantasma
- Isso tambem conserta a deteccao de MARCA por bloco, separando HIPRO
  (INNOVE) de HIPRO MED corretamente
- Diagnostico de importacao agora mostra a marca de cada equipamento
- Lista do PDF: clique por delegacao na linha inteira (mais robusto,
  sobrevive a re-render); "remover" tratado antes para nao navegar
- Modelo .docx: instrucao sem dois-pontos nos rotulos (defesa extra)

Co-Authored-By: Claude Opus 4.8 (1M context) <noreply@anthropic.com>
</commit_message>
<xml_diff>
--- a/MODELO - Condicoes Orcamento Contourline.docx
+++ b/MODELO - Condicoes Orcamento Contourline.docx
@@ -26,7 +26,7 @@
           <w:color w:val="666666"/>
           <w:sz w:val="18"/>
         </w:rPr>
-        <w:t xml:space="preserve">Preencha cada bloco abaixo. NÃO altere os rótulos em azul ("MARCA:", "EQUIPAMENTO:", "Condição 1:", etc.) — o sistema lê por eles.</w:t>
+        <w:t xml:space="preserve">Preencha cada bloco abaixo. Mantenha os rótulos em azul (MARCA, EQUIPAMENTO, Condição 1 a 4) no início da linha — o sistema lê por eles.</w:t>
       </w:r>
     </w:p>
     <w:p>
@@ -39,7 +39,7 @@
           <w:color w:val="666666"/>
           <w:sz w:val="18"/>
         </w:rPr>
-        <w:t xml:space="preserve">Para vários equipamentos: copie um bloco inteiro (de MARCA: até a Condição 4) e cole abaixo, trocando marca, nome e valores.</w:t>
+        <w:t xml:space="preserve">Para vários equipamentos, copie um bloco inteiro (da linha MARCA até a Condição 4) e cole abaixo, trocando marca, nome e valores.</w:t>
       </w:r>
     </w:p>
     <w:p>

</xml_diff>